<commit_message>
Revise Teichert op-ed to match his voice and correct byline
Rework to match the tone of the general's own reference op-ed: measured,
evidence-driven prose; lived-experience credential opening; real data
(cement imports above 20% since 2022, $46.8B Air Force deferred
maintenance) and concrete project-delay examples. Correct byline to
Brig. Gen. John Teichert (ret.) and add bio sign-off. Keeps Section 232
plus adversary-focused framing and folds in his strategic-material,
stockpile, and Buy-American-cement asks (~713 words).

Co-Authored-By: Claude Opus 4.8 <noreply@anthropic.com>
Claude-Session: https://claude.ai/code/session_01DigQ3dKjno8DETLrAxywef
</commit_message>
<xml_diff>
--- a/public/portfolio/teichert-trade-op-ed.docx
+++ b/public/portfolio/teichert-trade-op-ed.docx
@@ -3,24 +3,20 @@
 <w:document xmlns:wpc="http://schemas.microsoft.com/office/word/2010/wordprocessingCanvas" xmlns:mo="http://schemas.microsoft.com/office/mac/office/2008/main" xmlns:mc="http://schemas.openxmlformats.org/markup-compatibility/2006" xmlns:mv="urn:schemas-microsoft-com:mac:vml" xmlns:o="urn:schemas-microsoft-com:office:office" xmlns:r="http://schemas.openxmlformats.org/officeDocument/2006/relationships" xmlns:m="http://schemas.openxmlformats.org/officeDocument/2006/math" xmlns:v="urn:schemas-microsoft-com:vml" xmlns:wp14="http://schemas.microsoft.com/office/word/2010/wordprocessingDrawing" xmlns:wp="http://schemas.openxmlformats.org/drawingml/2006/wordprocessingDrawing" xmlns:w10="urn:schemas-microsoft-com:office:word" xmlns:w="http://schemas.openxmlformats.org/wordprocessingml/2006/main" xmlns:w14="http://schemas.microsoft.com/office/word/2010/wordml" xmlns:wpg="http://schemas.microsoft.com/office/word/2010/wordprocessingGroup" xmlns:wpi="http://schemas.microsoft.com/office/word/2010/wordprocessingInk" xmlns:wne="http://schemas.microsoft.com/office/word/2006/wordml" xmlns:wps="http://schemas.microsoft.com/office/word/2010/wordprocessingShape" mc:Ignorable="w14 wp14">
   <w:body>
     <w:p>
-      <w:pPr>
-        <w:jc w:val="left"/>
-      </w:pPr>
       <w:r>
         <w:rPr>
           <w:b/>
           <w:sz w:val="32"/>
         </w:rPr>
-        <w:t>The Trump Trade Agenda Is Working. Now It Has to Reach the Concrete.</w:t>
+        <w:t>The Trump Trade Agenda Is Rebuilding American Industry. It Cannot Stop at the Foundation.</w:t>
       </w:r>
     </w:p>
     <w:p>
       <w:r>
         <w:rPr>
           <w:i/>
-          <w:sz w:val="24"/>
         </w:rPr>
-        <w:t>By Lt. Gen. John Teichert, U.S. Air Force (Ret.)</w:t>
+        <w:t>By: Brig. Gen. John Teichert, U.S. Air Force (ret.)</w:t>
       </w:r>
     </w:p>
     <w:p/>
@@ -29,7 +25,7 @@
         <w:spacing w:after="200" w:line="276" w:lineRule="auto"/>
       </w:pPr>
       <w:r>
-        <w:t>In more than three decades in uniform, I learned that American power does not begin in the cockpit or the command center. It begins in the ground beneath them. Every runway I ever landed on, every hardened shelter, every missile silo and forward operating base rests on the same unglamorous foundation: concrete. You cannot project power from a country that cannot pour its own.</w:t>
+        <w:t>As a U.S. Air Force combat and test pilot with more than 2,000 flight hours logged, I never had the luxury of second-guessing the runway beneath me. The stakes were too high. Later, commanding Joint Base Andrews and Edwards Air Force Base and serving as the senior U.S. defense official in Iraq, I learned that the same principle reaches far beyond the airfield, to hardened shelters, command centers, fuel infrastructure, and the facilities where our service members live and work. All of it rests on one thing we rarely stop to consider: concrete, and the cement that makes it.</w:t>
       </w:r>
     </w:p>
     <w:p>
@@ -37,7 +33,7 @@
         <w:spacing w:after="200" w:line="276" w:lineRule="auto"/>
       </w:pPr>
       <w:r>
-        <w:t>So I have watched President Trump's trade agenda with the eye of a man who thinks about foundations. And I will say plainly what too many in Washington still hedge on: it is working. The tariffs on steel and aluminum that critics swore would wreck the economy have instead helped revive it. Idle mills are running again. Supply chains we handed to Beijing a generation ago are creeping back home. The idea that America should make the things America needs — above all the things America needs to defend itself — is no longer a fringe position. It is national policy, and it is overdue.</w:t>
+        <w:t>That is why I have watched the administration's trade agenda with growing confidence. Its central instinct is correct, and it is increasingly being vindicated. Tariffs on steel and aluminum that skeptics warned would backfire have instead helped bring idle mills and displaced supply chains back to American soil. The premise is sound: a nation that cannot make the essentials of its own defense is not fully sovereign. But the job is unfinished. The same logic now rebuilding our steel industry has yet to reach the material that underpins every base we operate.</w:t>
       </w:r>
     </w:p>
     <w:p>
@@ -45,7 +41,7 @@
         <w:spacing w:after="200" w:line="276" w:lineRule="auto"/>
       </w:pPr>
       <w:r>
-        <w:t>But an honest assessment is also an unfinished one. The same logic that is rebuilding our steel industry has a blind spot, and it hides in plain sight in the most literal building block of national strength. We have secured the beams. We have left the foundation exposed. That foundation is cement.</w:t>
+        <w:t>The vulnerability is real and measurable. Domestic cement production has been slipping even as imports have hovered above 20 percent of what we consume since 2022. Those imports arrive through long, opaque supply chains that make it difficult to verify whether the product meets America's exacting standards, and a growing share of the global market runs through China and the nations in its orbit. Beijing has spent two decades turning ordinary commerce into strategic leverage, from rare earths to pharmaceuticals to the ports that move global trade; cement is simply heavier and harder to ship, which lulls us into believing it is safe. When more than a fifth of a strategic input comes from abroad, foreign suppliers gain leverage over both the quality of what we build and the time it takes to build it. That is leverage no competitor should hold over the United States.</w:t>
       </w:r>
     </w:p>
     <w:p>
@@ -53,7 +49,7 @@
         <w:spacing w:after="200" w:line="276" w:lineRule="auto"/>
       </w:pPr>
       <w:r>
-        <w:t>Most Americans never think about cement, and that is precisely the problem. It is heavy, cheap by the ton, and utterly indispensable. It is also increasingly imported. By some estimates we now bring in close to a fifth of the cement we use, and that share climbs every time construction booms. A material we should treat as strategic, we treat as an afterthought — and our adversaries have noticed.</w:t>
+        <w:t>These are not hypothetical concerns. Material shortages have already delayed critical defense projects. A Navy runway and taxiway extension in California, begun in 2020, was set back by cement shortages, and a Defense Logistics Agency energy project in Florida ran into costly delays over concrete. Meanwhile, the Air Force carries roughly $46.8 billion in deferred maintenance and repair, and joint bases across the Department of War continue to receive sustainment funding well below what readiness demands. A supply chain we cannot control turns each of those backlogs into a potential mission risk.</w:t>
       </w:r>
     </w:p>
     <w:p>
@@ -61,7 +57,7 @@
         <w:spacing w:after="200" w:line="276" w:lineRule="auto"/>
       </w:pPr>
       <w:r>
-        <w:t>Here is what troubles a national-security professional. Cement is not sneakers. When a fifth of your foundation comes from overseas, and a growing slice of the global market runs through China and the countries in its orbit, you have handed a potential adversary a chokepoint on your own soil. Beijing has spent two decades weaponizing supply chains — rare earths, pharmaceuticals, ports. Cement is heavier and harder to ship, which lulls us into believing it is safe. It is not. A rival that can slow, price, or choke off the material we pour our bases and highways from holds leverage no competitor should ever have over the United States.</w:t>
+        <w:t>The administration already holds the right tool. Section 232 of the Trade Expansion Act allows a president to treat a genuine national-security threat as exactly that, not merely a commercial dispute, and it is the same authority applied to steel and aluminum. It should now be extended to cement, with the sharpest edge reserved for imports produced by or routed through our strategic competitors. Reliable partners are not the problem. Dependence on adversaries who would weaponize that dependence is, and a serious trade policy should draw that line without apology. The goal is not to tax our friends, but to ensure that no rival can ever again decide how quickly we pour a flight line.</w:t>
       </w:r>
     </w:p>
     <w:p>
@@ -69,7 +65,7 @@
         <w:spacing w:after="200" w:line="276" w:lineRule="auto"/>
       </w:pPr>
       <w:r>
-        <w:t>The President has already shown he understands the tool for this. Section 232 of the Trade Expansion Act exists for exactly this situation: it lets a president treat a genuine national-security threat as what it is, not merely a trade dispute. We used it for steel and aluminum. We should use it for cement. Foreign cement — and above all cement produced by or routed through our strategic competitors — should face tariffs that reflect its true cost to American security, not just its price at the port.</w:t>
+        <w:t>Tariffs alone, however, are not a strategy. Washington should pair them with the deliberate rebuilding of domestic capacity. Classify cement as a strategic material essential to national security. Establish a national stockpile to blunt the next shortage before it stalls a runway. And ensure that projects funded with taxpayer dollars use verifiable American cement, putting the full weight of federal procurement behind our own producers, from the quarry to the kiln. Tariffs buy time. Domestic capacity buys security.</w:t>
       </w:r>
     </w:p>
     <w:p>
@@ -77,31 +73,17 @@
         <w:spacing w:after="200" w:line="276" w:lineRule="auto"/>
       </w:pPr>
       <w:r>
-        <w:t>Let me be precise, because precision matters in policy as it does in targeting. This is not a call to punish every ally or to raise the cost of a backyard driveway. Canada and other reliable partners are not the threat. The threat is dependence on nations that would use that dependence against us. A smart cement policy draws that line clearly: press hardest on imports tied to adversaries, and pair every tariff with a serious push to rebuild American production, from the quarry to the kiln. Tariffs buy time. Domestic capacity buys security.</w:t>
+        <w:t>The men and women who serve this country deserve airfields, shelters, and command centers they can depend on, foundations forged here at home rather than subject to the goodwill of a rival. The administration built its trade agenda on the conviction that a nation which cannot make things cannot stay free. It has proven the point with metal. Now it must follow that conviction all the way down, to the gray and unglamorous material that every one of those industries, and every one of our bases, is quite literally built upon.</w:t>
       </w:r>
     </w:p>
+    <w:p/>
     <w:p>
-      <w:pPr>
-        <w:spacing w:after="200" w:line="276" w:lineRule="auto"/>
-      </w:pPr>
       <w:r>
-        <w:t>Skeptics will say cement is too cheap and too local to bother with. They said the same about steel, and they were wrong. They will warn that prices might tick up. Perhaps — but ask any commander whether he would rather pay a little more for a runway or lie awake wondering whether the concrete for it will arrive at all. We do not measure the worth of a fortress by the discount on its bricks.</w:t>
-      </w:r>
-    </w:p>
-    <w:p>
-      <w:pPr>
-        <w:spacing w:after="200" w:line="276" w:lineRule="auto"/>
-      </w:pPr>
-      <w:r>
-        <w:t>The President built this trade agenda on a simple and correct instinct: a nation that cannot make things cannot stay free. He has applied that instinct to metal, to microchips, to the industries of the future. The task now is to follow it all the way down — to the gray, unglamorous, load-bearing stuff that every one of those industries is literally built upon.</w:t>
-      </w:r>
-    </w:p>
-    <w:p>
-      <w:pPr>
-        <w:spacing w:after="200" w:line="276" w:lineRule="auto"/>
-      </w:pPr>
-      <w:r>
-        <w:t>We have poured a strong foundation for an American renewal. Let us not leave it resting on someone else's cement.</w:t>
+        <w:rPr>
+          <w:i/>
+          <w:sz w:val="21"/>
+        </w:rPr>
+        <w:t>United States Air Force Brig. Gen. John Teichert (ret.) is an expert on foreign affairs and military strategy. He served as commander of Joint Base Andrews and Edwards Air Force Base, was the senior U.S. defense official to Iraq, and retired as the assistant deputy under secretary of the Air Force for international affairs.</w:t>
       </w:r>
     </w:p>
     <w:sectPr>

</xml_diff>

<commit_message>
Reframe Teichert op-ed around Section 301 trade enforcement
Recenter the piece on applauding Section 301 enforcement against China's
subsidies and overcapacity, and call for a Section 301 investigation into
foreign cement. Add a closing Section 232 comparison (steel/aluminum, and
the 2025 copper tariff) to argue cement deserves the same seriousness.
Replace all reference-op-ed data points with fresh sourced figures:
China's ~half of world cement output (USGS, 2024), U.S. import
concentration from Turkey/Vietnam/Canada, and net import tonnage (~710
words).

Co-Authored-By: Claude Opus 4.8 <noreply@anthropic.com>
Claude-Session: https://claude.ai/code/session_01DigQ3dKjno8DETLrAxywef
</commit_message>
<xml_diff>
--- a/public/portfolio/teichert-trade-op-ed.docx
+++ b/public/portfolio/teichert-trade-op-ed.docx
@@ -8,7 +8,7 @@
           <w:b/>
           <w:sz w:val="32"/>
         </w:rPr>
-        <w:t>The Trump Trade Agenda Is Rebuilding American Industry. It Cannot Stop at the Foundation.</w:t>
+        <w:t>America Is Finally Enforcing Fair Trade. Cement Belongs on the List.</w:t>
       </w:r>
     </w:p>
     <w:p>
@@ -25,7 +25,7 @@
         <w:spacing w:after="200" w:line="276" w:lineRule="auto"/>
       </w:pPr>
       <w:r>
-        <w:t>As a U.S. Air Force combat and test pilot with more than 2,000 flight hours logged, I never had the luxury of second-guessing the runway beneath me. The stakes were too high. Later, commanding Joint Base Andrews and Edwards Air Force Base and serving as the senior U.S. defense official in Iraq, I learned that the same principle reaches far beyond the airfield, to hardened shelters, command centers, fuel infrastructure, and the facilities where our service members live and work. All of it rests on one thing we rarely stop to consider: concrete, and the cement that makes it.</w:t>
+        <w:t>As a U.S. Air Force combat and test pilot with more than 2,000 flight hours, I never had the luxury of doubting the runway beneath me. The stakes were too high. Commanding Joint Base Andrews and Edwards Air Force Base, and later serving as the senior U.S. defense official in Iraq, I came to see that the same truth governs far more than the airfield. It governs the hardened shelters, command centers, and fuel infrastructure that let America fight and win. And all of it begins with something most Americans never think about: the cement that becomes the concrete beneath our forces.</w:t>
       </w:r>
     </w:p>
     <w:p>
@@ -33,7 +33,7 @@
         <w:spacing w:after="200" w:line="276" w:lineRule="auto"/>
       </w:pPr>
       <w:r>
-        <w:t>That is why I have watched the administration's trade agenda with growing confidence. Its central instinct is correct, and it is increasingly being vindicated. Tariffs on steel and aluminum that skeptics warned would backfire have instead helped bring idle mills and displaced supply chains back to American soil. The premise is sound: a nation that cannot make the essentials of its own defense is not fully sovereign. But the job is unfinished. The same logic now rebuilding our steel industry has yet to reach the material that underpins every base we operate.</w:t>
+        <w:t>That is why I have welcomed one of the most consequential and least understood shifts in American economic policy: a renewed willingness to enforce fair trade. Under Section 301 of the Trade Act of 1974, the U.S. Trade Representative has moved decisively against China's unfair practices, the subsidies, forced technology transfer, and deliberate overcapacity that have hollowed out one American industry after another. In 2024, Washington raised Section 301 tariffs on Chinese electric vehicles, batteries, semiconductors, steel, and ship-to-shore cranes. In 2025, it advanced a landmark 301 action against Beijing's bid to dominate shipbuilding and maritime logistics. This is not protectionism for its own sake. It is the overdue recognition that a market rigged by a strategic competitor is not a free market at all.</w:t>
       </w:r>
     </w:p>
     <w:p>
@@ -41,7 +41,7 @@
         <w:spacing w:after="200" w:line="276" w:lineRule="auto"/>
       </w:pPr>
       <w:r>
-        <w:t>The vulnerability is real and measurable. Domestic cement production has been slipping even as imports have hovered above 20 percent of what we consume since 2022. Those imports arrive through long, opaque supply chains that make it difficult to verify whether the product meets America's exacting standards, and a growing share of the global market runs through China and the nations in its orbit. Beijing has spent two decades turning ordinary commerce into strategic leverage, from rare earths to pharmaceuticals to the ports that move global trade; cement is simply heavier and harder to ship, which lulls us into believing it is safe. When more than a fifth of a strategic input comes from abroad, foreign suppliers gain leverage over both the quality of what we build and the time it takes to build it. That is leverage no competitor should hold over the United States.</w:t>
+        <w:t>But the enforcers have a blind spot, and it sits at the literal foundation of national defense. China now produces nearly half of all the cement made on earth, roughly 1.9 billion of the 4 billion tons the world poured in 2024, much of it behind the same wall of state subsidies and manufactured overcapacity that Section 301 was written to confront. That distortion ripples outward through global prices and supply, and the United States feels it directly. In 2024 we imported cement from 31 countries, and just three of them, Turkey, Vietnam, and Canada, supplied about 70 percent of it. Net imports of cement and clinker reached some 27 million tons, close to a quarter of everything we used.</w:t>
       </w:r>
     </w:p>
     <w:p>
@@ -49,7 +49,7 @@
         <w:spacing w:after="200" w:line="276" w:lineRule="auto"/>
       </w:pPr>
       <w:r>
-        <w:t>These are not hypothetical concerns. Material shortages have already delayed critical defense projects. A Navy runway and taxiway extension in California, begun in 2020, was set back by cement shortages, and a Defense Logistics Agency energy project in Florida ran into costly delays over concrete. Meanwhile, the Air Force carries roughly $46.8 billion in deferred maintenance and repair, and joint bases across the Department of War continue to receive sustainment funding well below what readiness demands. A supply chain we cannot control turns each of those backlogs into a potential mission risk.</w:t>
+        <w:t>For a national-security professional, those numbers describe a vulnerability, not a convenience. Cement is heavy, low-margin, and easy to dismiss as a simple commodity. It is nothing of the kind. It is the material that becomes our runways, our hardened aircraft shelters, our silos, and the barracks where our people sleep. When a quarter of it rides in on long ocean supply chains, chains increasingly shaped by a rival that has weaponized commerce before, from rare earths to critical minerals, we hand foreign suppliers quiet leverage over how fast, how well, and even whether we can build what our defense requires.</w:t>
       </w:r>
     </w:p>
     <w:p>
@@ -57,7 +57,7 @@
         <w:spacing w:after="200" w:line="276" w:lineRule="auto"/>
       </w:pPr>
       <w:r>
-        <w:t>The administration already holds the right tool. Section 232 of the Trade Expansion Act allows a president to treat a genuine national-security threat as exactly that, not merely a commercial dispute, and it is the same authority applied to steel and aluminum. It should now be extended to cement, with the sharpest edge reserved for imports produced by or routed through our strategic competitors. Reliable partners are not the problem. Dependence on adversaries who would weaponize that dependence is, and a serious trade policy should draw that line without apology. The goal is not to tax our friends, but to ensure that no rival can ever again decide how quickly we pour a flight line.</w:t>
+        <w:t>The remedy is one the administration already knows how to use. The U.S. Trade Representative should open a Section 301 investigation into foreign cement, training its sharpest scrutiny on producers that feed off state subsidies and dump their overcapacity into our market. The tool is proven, the legal ground is well-worn, and the logic is identical to the cases already underway: fair competition, or a tariff to offset the cheating. Reliable partners have nothing to fear from an honest accounting. Adversaries who would turn our dependence against us should.</w:t>
       </w:r>
     </w:p>
     <w:p>
@@ -65,7 +65,7 @@
         <w:spacing w:after="200" w:line="276" w:lineRule="auto"/>
       </w:pPr>
       <w:r>
-        <w:t>Tariffs alone, however, are not a strategy. Washington should pair them with the deliberate rebuilding of domestic capacity. Classify cement as a strategic material essential to national security. Establish a national stockpile to blunt the next shortage before it stalls a runway. And ensure that projects funded with taxpayer dollars use verifiable American cement, putting the full weight of federal procurement behind our own producers, from the quarry to the kiln. Tariffs buy time. Domestic capacity buys security.</w:t>
+        <w:t>And if we are honest about how we already protect the inputs of national power, cement's exclusion makes no sense. We shield steel and aluminum under Section 232's national-security authority, and in 2025 we extended a 50 percent tariff to copper after the government concluded that import dependence threatens to impair our security. Copper runs the wire. Steel frames the building. Cement is the foundation both stand on, and it deserves at least the seriousness we already give the pipe and the beam. Enforcement should be paired, too, with the patient work of rebuilding domestic capacity, so that tariffs buy time and American plants buy permanence.</w:t>
       </w:r>
     </w:p>
     <w:p>
@@ -73,7 +73,7 @@
         <w:spacing w:after="200" w:line="276" w:lineRule="auto"/>
       </w:pPr>
       <w:r>
-        <w:t>The men and women who serve this country deserve airfields, shelters, and command centers they can depend on, foundations forged here at home rather than subject to the goodwill of a rival. The administration built its trade agenda on the conviction that a nation which cannot make things cannot stay free. It has proven the point with metal. Now it must follow that conviction all the way down, to the gray and unglamorous material that every one of those industries, and every one of our bases, is quite literally built upon.</w:t>
+        <w:t>The men and women who serve this country deserve airfields and shelters they can count on, foundations poured from a supply chain we control rather than one a competitor can throttle. The administration has shown, through Section 301, that it will no longer pretend a rigged market is a free one. It should carry that conviction all the way down, to the ground our forces stand on.</w:t>
       </w:r>
     </w:p>
     <w:p/>

</xml_diff>